<commit_message>
Remove simulator figure from system documentation
Drop Figure 1.3 (simulator screenshot) and its caption.

Co-Authored-By: Claude Opus 5.5 <noreply@anthropic.com>
</commit_message>
<xml_diff>
--- a/ESP32_Offline_Bell_Matrix_System_Documentation.docx
+++ b/ESP32_Offline_Bell_Matrix_System_Documentation.docx
@@ -246,63 +246,6 @@
           <w:sz w:val="18"/>
         </w:rPr>
         <w:t>Figure 1.2: Live Web Dashboard displaying Real-Time Clock, Active Period Countdown, and Activity Log.</w:t>
-      </w:r>
-    </w:p>
-    <w:p>
-      <w:pPr>
-        <w:keepNext/>
-        <w:spacing w:before="120" w:after="40"/>
-        <w:jc w:val="center"/>
-      </w:pPr>
-      <w:r>
-        <w:drawing>
-          <wp:inline xmlns:a="http://schemas.openxmlformats.org/drawingml/2006/main" xmlns:pic="http://schemas.openxmlformats.org/drawingml/2006/picture">
-            <wp:extent cx="5120640" cy="3040380"/>
-            <wp:docPr id="3" name="Picture 3"/>
-            <wp:cNvGraphicFramePr>
-              <a:graphicFrameLocks noChangeAspect="1"/>
-            </wp:cNvGraphicFramePr>
-            <a:graphic>
-              <a:graphicData uri="http://schemas.openxmlformats.org/drawingml/2006/picture">
-                <pic:pic>
-                  <pic:nvPicPr>
-                    <pic:cNvPr id="0" name="page1_3_dual_simulator_workbench.png"/>
-                    <pic:cNvPicPr/>
-                  </pic:nvPicPr>
-                  <pic:blipFill>
-                    <a:blip r:embed="rId11"/>
-                    <a:stretch>
-                      <a:fillRect/>
-                    </a:stretch>
-                  </pic:blipFill>
-                  <pic:spPr>
-                    <a:xfrm>
-                      <a:off x="0" y="0"/>
-                      <a:ext cx="5120640" cy="3040380"/>
-                    </a:xfrm>
-                    <a:prstGeom prst="rect"/>
-                  </pic:spPr>
-                </pic:pic>
-              </a:graphicData>
-            </a:graphic>
-          </wp:inline>
-        </w:drawing>
-      </w:r>
-    </w:p>
-    <w:p>
-      <w:pPr>
-        <w:keepNext/>
-        <w:spacing w:after="200"/>
-        <w:jc w:val="center"/>
-      </w:pPr>
-      <w:r>
-        <w:rPr>
-          <w:rFonts w:ascii="Calibri" w:hAnsi="Calibri"/>
-          <w:i/>
-          <w:color w:val="718096"/>
-          <w:sz w:val="18"/>
-        </w:rPr>
-        <w:t>Figure 1.3: Dual System Workbench simulating 128x64 Matrix DMA Output and SoftAP Web Portal.</w:t>
       </w:r>
     </w:p>
     <w:p>

</xml_diff>